<commit_message>
Trial system: no-card signup, countdown header, touchpoints, admin bypass, updated pricing
</commit_message>
<xml_diff>
--- a/SmartKitchen_UserManual_v4.docx
+++ b/SmartKitchen_UserManual_v4.docx
@@ -114,7 +114,7 @@
           <w:sz w:val="56"/>
           <w:szCs w:val="56"/>
         </w:rPr>
-        <w:t xml:space="preserve">Smart Kitchen</w:t>
+        <w:t xml:space="preserve">Smart Kitchen™</w:t>
       </w:r>
     </w:p>
     <w:p>
@@ -213,7 +213,7 @@
           <w:sz w:val="32"/>
           <w:szCs w:val="32"/>
         </w:rPr>
-        <w:t xml:space="preserve">FOREWORD  How Smart Kitchen Came to Be</w:t>
+        <w:t xml:space="preserve">FOREWORD  How Smart Kitchen™ Came to Be</w:t>
       </w:r>
     </w:p>
     <w:p>
@@ -374,7 +374,7 @@
           <w:sz w:val="22"/>
           <w:szCs w:val="22"/>
         </w:rPr>
-        <w:t xml:space="preserve">That's Smart Kitchen. Built by a husband who does the cooking, for anyone who's ever stood in front of the refrigerator at 6 PM too tired to think. The app doesn't replace the cook — it just takes the decision off their plate.</w:t>
+        <w:t xml:space="preserve">That's Smart Kitchen™. Built by a husband who does the cooking, for anyone who's ever stood in front of the refrigerator at 6 PM too tired to think. The app doesn't replace the cook — it just takes the decision off their plate.</w:t>
       </w:r>
     </w:p>
     <w:p>
@@ -400,7 +400,7 @@
           <w:sz w:val="22"/>
           <w:szCs w:val="22"/>
         </w:rPr>
-        <w:t xml:space="preserve">— Rick Rinehart, Creator, Smart Kitchen</w:t>
+        <w:t xml:space="preserve">— Rick Rinehart, Creator, Smart Kitchen™</w:t>
       </w:r>
     </w:p>
     <w:p>
@@ -422,7 +422,7 @@
           <w:sz w:val="32"/>
           <w:szCs w:val="32"/>
         </w:rPr>
-        <w:t xml:space="preserve">SECTION 1  Welcome to Smart Kitchen</w:t>
+        <w:t xml:space="preserve">SECTION 1  Welcome to Smart Kitchen™</w:t>
       </w:r>
     </w:p>
     <w:p>
@@ -435,7 +435,7 @@
           <w:sz w:val="22"/>
           <w:szCs w:val="22"/>
         </w:rPr>
-        <w:t xml:space="preserve">Smart Kitchen is your family's AI-powered kitchen assistant. It helps you figure out what to cook, keeps track of what's in your refrigerator, freezer, and pantry, builds a full week of meal plans tailored to your family's needs, and generates your grocery list — all in one place.</w:t>
+        <w:t xml:space="preserve">Smart Kitchen™ is your family's AI-powered kitchen assistant. It helps you figure out what to cook, keeps track of what's in your refrigerator, freezer, and pantry, builds a full week of meal plans tailored to your family's needs, and generates your grocery list — all in one place.</w:t>
       </w:r>
     </w:p>
     <w:p>
@@ -448,7 +448,7 @@
           <w:sz w:val="22"/>
           <w:szCs w:val="22"/>
         </w:rPr>
-        <w:t xml:space="preserve">You don't need to download anything from the App Store. Smart Kitchen runs right in your phone's browser. Just open it and you're ready to go.</w:t>
+        <w:t xml:space="preserve">You don't need to download anything from the App Store. Smart Kitchen™ runs right in your phone's browser. Just open it and you're ready to go.</w:t>
       </w:r>
     </w:p>
     <w:p>
@@ -478,7 +478,7 @@
           <w:sz w:val="22"/>
           <w:szCs w:val="22"/>
         </w:rPr>
-        <w:t xml:space="preserve">Smart Kitchen is designed for anyone who feeds a family — whether that's a busy parent managing multiple kids' schedules, a caregiver managing a loved one's medical diet, or a senior who wants simple, healthy meal ideas without the overwhelm.</w:t>
+        <w:t xml:space="preserve">Smart Kitchen™ is designed for anyone who feeds a family — whether that's a busy parent managing multiple kids' schedules, a caregiver managing a loved one's medical diet, or a senior who wants simple, healthy meal ideas without the overwhelm.</w:t>
       </w:r>
     </w:p>
     <w:p>
@@ -620,7 +620,7 @@
                 <w:sz w:val="22"/>
                 <w:szCs w:val="22"/>
               </w:rPr>
-              <w:t xml:space="preserve">Add It to Your Home Screen: Make Smart Kitchen feel just like a regular app — one tap to open. On iPhone: tap the Share button in Safari, then 'Add to Home Screen.' On Android: tap the three-dot menu in Chrome, then 'Add to Home Screen.'</w:t>
+              <w:t xml:space="preserve">Add It to Your Home Screen: Make Smart Kitchen™ feel just like a regular app — one tap to open. On iPhone: tap the Share button in Safari, then 'Add to Home Screen.' On Android: tap the three-dot menu in Chrome, then 'Add to Home Screen.'</w:t>
             </w:r>
           </w:p>
         </w:tc>
@@ -653,7 +653,7 @@
           <w:sz w:val="22"/>
           <w:szCs w:val="22"/>
         </w:rPr>
-        <w:t xml:space="preserve">Smart Kitchen includes a Senior Mode designed for users who prefer larger text, simplified navigation, and a cleaner interface. It can be turned on or off at any time without removing any features. Go to Settings and tap Senior Mode to toggle it instantly.</w:t>
+        <w:t xml:space="preserve">Smart Kitchen™ includes a Senior Mode designed for users who prefer larger text, simplified navigation, and a cleaner interface. It can be turned on or off at any time without removing any features. Go to Settings and tap Senior Mode to toggle it instantly.</w:t>
       </w:r>
     </w:p>
     <w:p>
@@ -688,7 +688,7 @@
           <w:sz w:val="22"/>
           <w:szCs w:val="22"/>
         </w:rPr>
-        <w:t xml:space="preserve">The first time you open Smart Kitchen, a friendly Setup Wizard walks you through everything. It sets up your family profile, dietary needs, preferences, and starting inventory so the app is ready from day one. The whole thing takes about five minutes.</w:t>
+        <w:t xml:space="preserve">The first time you open Smart Kitchen™, a friendly Setup Wizard walks you through everything. It sets up your family profile, dietary needs, preferences, and starting inventory so the app is ready from day one. The whole thing takes about five minutes.</w:t>
       </w:r>
     </w:p>
     <w:p>
@@ -718,7 +718,7 @@
           <w:sz w:val="22"/>
           <w:szCs w:val="22"/>
         </w:rPr>
-        <w:t xml:space="preserve">Everything about who the app is cooking for lives in Step 1. Set it once and Smart Kitchen applies it to every recipe and meal plan automatically.</w:t>
+        <w:t xml:space="preserve">Everything about who the app is cooking for lives in Step 1. Set it once and Smart Kitchen™ applies it to every recipe and meal plan automatically.</w:t>
       </w:r>
     </w:p>
     <w:tbl>
@@ -1012,7 +1012,7 @@
           <w:sz w:val="22"/>
           <w:szCs w:val="22"/>
         </w:rPr>
-        <w:t xml:space="preserve">Smart Kitchen enforces these at the AI level — it substitutes ingredients automatically, not just flags them. Brown rice instead of white rice. Whole wheat pasta instead of regular. Reduced sodium throughout. Set once, applied permanently.</w:t>
+        <w:t xml:space="preserve">Smart Kitchen™ enforces these at the AI level — it substitutes ingredients automatically, not just flags them. Brown rice instead of white rice. Whole wheat pasta instead of regular. Reduced sodium throughout. Set once, applied permanently.</w:t>
       </w:r>
     </w:p>
     <w:tbl>
@@ -1382,7 +1382,7 @@
                 <w:sz w:val="22"/>
                 <w:szCs w:val="22"/>
               </w:rPr>
-              <w:t xml:space="preserve">Medical Dietary Profiles — How They Work: Smart Kitchen doesn't just flag non-compliant ingredients — it replaces them. A diabetic profile means every meal plan uses brown rice instead of white, whole wheat pasta instead of regular, and lower-glycemic choices throughout. Set it once and the app handles it automatically. Always follow your healthcare provider's specific dietary guidance.</w:t>
+              <w:t xml:space="preserve">Medical Dietary Profiles — How They Work: Smart Kitchen™ doesn't just flag non-compliant ingredients — it replaces them. A diabetic profile means every meal plan uses brown rice instead of white, whole wheat pasta instead of regular, and lower-glycemic choices throughout. Set it once and the app handles it automatically. Always follow your healthcare provider's specific dietary guidance.</w:t>
             </w:r>
           </w:p>
         </w:tc>
@@ -1723,7 +1723,7 @@
           <w:sz w:val="22"/>
           <w:szCs w:val="22"/>
         </w:rPr>
-        <w:t xml:space="preserve">Your inventory is the heart of Smart Kitchen. The more accurate it is, the better your recipe suggestions and meal plans will be.</w:t>
+        <w:t xml:space="preserve">Your inventory is the heart of Smart Kitchen™. The more accurate it is, the better your recipe suggestions and meal plans will be.</w:t>
       </w:r>
     </w:p>
     <w:p>
@@ -2144,7 +2144,7 @@
           <w:sz w:val="22"/>
           <w:szCs w:val="22"/>
         </w:rPr>
-        <w:t xml:space="preserve">Smart Kitchen now includes expanded inventory categories to cover the full household. In addition to the original food categories (Protein, Produce, Dairy, Pantry, Grains, Spices, Frozen, Condiments, Baking), you can now assign items to: Snacks, Beverages, Household, Cleaning, Personal Care, and Pet. Items like paper towels, shampoo, and laundry detergent now have a proper home instead of defaulting to Other.</w:t>
+        <w:t xml:space="preserve">Smart Kitchen™ now includes expanded inventory categories to cover the full household. In addition to the original food categories (Protein, Produce, Dairy, Pantry, Grains, Spices, Frozen, Condiments, Baking), you can now assign items to: Snacks, Beverages, Household, Cleaning, Personal Care, and Pet. Items like paper towels, shampoo, and laundry detergent now have a proper home instead of defaulting to Other.</w:t>
       </w:r>
     </w:p>
     <w:p>
@@ -2234,7 +2234,7 @@
           <w:sz w:val="22"/>
           <w:szCs w:val="22"/>
         </w:rPr>
-        <w:t xml:space="preserve">Smart Kitchen sends a reminder twice a week to do a quick inventory check. Sunday sets you up for the week ahead. Wednesday catches mid-week changes. Each check-in takes about two minutes.</w:t>
+        <w:t xml:space="preserve">Smart Kitchen™ sends a reminder twice a week to do a quick inventory check. Sunday sets you up for the week ahead. Wednesday catches mid-week changes. Each check-in takes about two minutes.</w:t>
       </w:r>
     </w:p>
     <w:p>
@@ -2603,7 +2603,7 @@
           <w:sz w:val="22"/>
           <w:szCs w:val="22"/>
         </w:rPr>
-        <w:t xml:space="preserve">Mark hectic evenings as Busy Nights and Smart Kitchen automatically assigns a quick, easy dinner — under 20 minutes, one pan, or slow-cooker. Tap the 'Busy?' flag on any day's card, select 'Busy Night,' and only that night changes. Tap again to restore a regular meal.</w:t>
+        <w:t xml:space="preserve">Mark hectic evenings as Busy Nights and Smart Kitchen™ automatically assigns a quick, easy dinner — under 20 minutes, one pan, or slow-cooker. Tap the 'Busy?' flag on any day's card, select 'Busy Night,' and only that night changes. Tap again to restore a regular meal.</w:t>
       </w:r>
     </w:p>
     <w:p>
@@ -2633,7 +2633,7 @@
           <w:sz w:val="22"/>
           <w:szCs w:val="22"/>
         </w:rPr>
-        <w:t xml:space="preserve">When you finish cooking a meal from your plan, tap Made It! on the meal card. Smart Kitchen automatically removes the ingredients you used from your inventory — no manual updating needed.</w:t>
+        <w:t xml:space="preserve">When you finish cooking a meal from your plan, tap Made It! on the meal card. Smart Kitchen™ automatically removes the ingredients you used from your inventory — no manual updating needed.</w:t>
       </w:r>
     </w:p>
     <w:p>
@@ -2755,7 +2755,7 @@
           <w:sz w:val="22"/>
           <w:szCs w:val="22"/>
         </w:rPr>
-        <w:t xml:space="preserve">The Desserts section works exactly like the Recipes section — just focused on sweet treats. Smart Kitchen suggests dessert ideas based on what you have in your Baking category and pantry inventory. On Hand and Needed badges appear on every ingredient. Tap 'I Cooked This' when done to update your inventory automatically.</w:t>
+        <w:t xml:space="preserve">The Desserts section works exactly like the Recipes section — just focused on sweet treats. Smart Kitchen™ suggests dessert ideas based on what you have in your Baking category and pantry inventory. On Hand and Needed badges appear on every ingredient. Tap 'I Cooked This' when done to update your inventory automatically.</w:t>
       </w:r>
     </w:p>
     <w:tbl>
@@ -2838,7 +2838,7 @@
           <w:sz w:val="22"/>
           <w:szCs w:val="22"/>
         </w:rPr>
-        <w:t xml:space="preserve">Smart Kitchen builds your grocery list automatically from your meal plan and recipe needs. Items are grouped by store category so you can shop each section without backtracking.</w:t>
+        <w:t xml:space="preserve">Smart Kitchen™ builds your grocery list automatically from your meal plan and recipe needs. Items are grouped by store category so you can shop each section without backtracking.</w:t>
       </w:r>
     </w:p>
     <w:p>
@@ -3965,7 +3965,7 @@
           <w:sz w:val="32"/>
           <w:szCs w:val="32"/>
         </w:rPr>
-        <w:t xml:space="preserve">APPENDIX  Smart Kitchen Roadmap</w:t>
+        <w:t xml:space="preserve">APPENDIX  Smart Kitchen™ Roadmap</w:t>
       </w:r>
     </w:p>
     <w:tbl>
@@ -4252,7 +4252,7 @@
           <w:sz w:val="20"/>
           <w:szCs w:val="20"/>
         </w:rPr>
-        <w:t xml:space="preserve">Smart Kitchen  •  User Manual  •  Version 4.0  •  2026</w:t>
+        <w:t xml:space="preserve">Smart Kitchen™  •  User Manual  •  Version 4.0  •  2026</w:t>
       </w:r>
     </w:p>
     <w:p>

</xml_diff>